<commit_message>
Oct 25: Ed = Big Head = Big Ed; hockey-stick story told once (Ch. 5)
Co-authored-by: Mthompson6782 <Mthompson6782@users.noreply.github.com>
</commit_message>
<xml_diff>
--- a/Am_I_The_Bad_Guy_Master_Draft.docx
+++ b/Am_I_The_Bad_Guy_Master_Draft.docx
@@ -1420,7 +1420,7 @@
         <w:pStyle w:val="BodyText"/>
       </w:pPr>
       <w:r>
-        <w:t xml:space="preserve">We had Eddie, a good guy whose family was even poorer than ours, but they did hustle. His dad ran a tiny cramped corner store that sold stale bread, single cigarettes, and cheap soda to keep the lights on. We were at Ed’s house once and Chris’s fat ass flopped on the sofa. That shit collapsed and red stuff started oozing out from underneath it. Artie was like,</w:t>
+        <w:t xml:space="preserve">We had Eddie, a good guy whose family was even poorer than ours, but they did hustle. His dad ran a tiny cramped corner store that sold stale bread, single cigarettes, and cheap soda to keep the lights on. We were at Eddie’s house once and Chris’s fat ass flopped on the sofa. That shit collapsed and red stuff started oozing out from underneath it. Artie was like,</w:t>
       </w:r>
       <w:r>
         <w:t xml:space="preserve"> </w:t>
@@ -1512,7 +1512,7 @@
         <w:pStyle w:val="BodyText"/>
       </w:pPr>
       <w:r>
-        <w:t xml:space="preserve">Big Ed, who we called</w:t>
+        <w:t xml:space="preserve">Ed, aka Big Ed, who we called</w:t>
       </w:r>
       <w:r>
         <w:t xml:space="preserve"> </w:t>
@@ -3086,15 +3086,15 @@
         <w:pStyle w:val="BodyText"/>
       </w:pPr>
       <w:r>
-        <w:t xml:space="preserve">Eddie would usually bring Artie Buckalew and Big Head along. Big Head was a huge pussy who betrayed me every chance he got. For whatever reason there must be some overlap between being a coward and being a thief, because Big Head was a master at it. He could steal the toast from underneath the butter before it even melted.</w:t>
-      </w:r>
-    </w:p>
-    <w:p>
-      <w:pPr>
-        <w:pStyle w:val="BodyText"/>
-      </w:pPr>
-      <w:r>
-        <w:t xml:space="preserve">Eddie would drive us out to Marley Station Mall, and Big Head would basically go shopping. Sam Goody for CDs. Trench coat, load up. Sports Authority, Dick’s, anything he could get his hands on. This motherfucker once stole an entire hockey stick by shoving it down his shirt, threading it through his pant leg, and stiff-walking bow-legged right out the front doors.</w:t>
+        <w:t xml:space="preserve">Eddie would usually bring Artie Buckalew and Big Head — Big Ed — along. Big Head was a huge pussy who betrayed me every chance he got. For whatever reason there must be some overlap between being a coward and being a thief, because Big Head was a master at it. He could steal the toast from underneath the butter before it even melted.</w:t>
+      </w:r>
+    </w:p>
+    <w:p>
+      <w:pPr>
+        <w:pStyle w:val="BodyText"/>
+      </w:pPr>
+      <w:r>
+        <w:t xml:space="preserve">Eddie would drive us out to Marley Station Mall, and Big Head would basically go shopping. Sam Goody for CDs. Trench coat, load up. Sports Authority, Dick’s, anything he could get his hands on.</w:t>
       </w:r>
     </w:p>
     <w:p>

</xml_diff>

<commit_message>
Ch. 20: Rick Desper's size
Co-authored-by: Mthompson6782 <Mthompson6782@users.noreply.github.com>
</commit_message>
<xml_diff>
--- a/Am_I_The_Bad_Guy_Master_Draft.docx
+++ b/Am_I_The_Bad_Guy_Master_Draft.docx
@@ -7757,6 +7757,14 @@
       </w:pPr>
       <w:r>
         <w:t xml:space="preserve">The coach was John Rallo. John was 6’4” and 260, a Renzo Gracie brown belt. He didn’t give me a speech. He didn’t ask about my background. He looked at me, and he sent me over to wrestle a guy named Rick Desper.</w:t>
+      </w:r>
+    </w:p>
+    <w:p>
+      <w:pPr>
+        <w:pStyle w:val="BodyText"/>
+      </w:pPr>
+      <w:r>
+        <w:t xml:space="preserve">So about Rick. Rick was like 5’7” and maybe 150 pounds.</w:t>
       </w:r>
     </w:p>
     <w:p>

</xml_diff>

<commit_message>
Koch chapter: The Johns Hopkins University Whiting School of Engineering
Co-authored-by: Mthompson6782 <Mthompson6782@users.noreply.github.com>
</commit_message>
<xml_diff>
--- a/Am_I_The_Bad_Guy_Master_Draft.docx
+++ b/Am_I_The_Bad_Guy_Master_Draft.docx
@@ -9529,7 +9529,16 @@
         <w:pStyle w:val="BodyText"/>
       </w:pPr>
       <w:r>
-        <w:t xml:space="preserve">Between the corporate pressure at Koch, the MIT Sloan coursework, and grinding on the mats every night, I was redlining my body and ignoring the fatigue building up underneath.</w:t>
+        <w:t xml:space="preserve">Between the corporate pressure at Koch, the MIT Sloan coursework, going to The Johns Hopkins University Whiting School of Engineering (and yes, we pronounce the</w:t>
+      </w:r>
+      <w:r>
+        <w:t xml:space="preserve"> </w:t>
+      </w:r>
+      <w:r>
+        <w:t xml:space="preserve">“The”</w:t>
+      </w:r>
+      <w:r>
+        <w:t xml:space="preserve">), and grinding on the mats every night, I was redlining my body and ignoring the fatigue building up underneath.</w:t>
       </w:r>
     </w:p>
     <w:p>

</xml_diff>

<commit_message>
Hopkins started at BGE, kept chipping away
Co-authored-by: Mthompson6782 <Mthompson6782@users.noreply.github.com>
</commit_message>
<xml_diff>
--- a/Am_I_The_Bad_Guy_Master_Draft.docx
+++ b/Am_I_The_Bad_Guy_Master_Draft.docx
@@ -8757,7 +8757,7 @@
         <w:pStyle w:val="BodyText"/>
       </w:pPr>
       <w:r>
-        <w:t xml:space="preserve">By then, I had moved from TAI over to BGE/Exelon. I was stationed down at Spring Gardens on the Patapsco River, re-engineering the natural gas distribution system for Baltimore City and working on the plant’s Liquefied Natural Gas (LNG) control systems. It was serious, high-consequence work — the kind where a bad calibration doesn’t just cost money, it levels a city block.</w:t>
+        <w:t xml:space="preserve">By then, I had moved from TAI over to BGE/Exelon. I was stationed down at Spring Gardens on the Patapsco River, re-engineering the natural gas distribution system for Baltimore City and working on the plant’s Liquefied Natural Gas (LNG) control systems. It was serious, high-consequence work — the kind where a bad calibration doesn’t just cost money, it levels a city block. That’s also when I started at The Johns Hopkins University Whiting School of Engineering, way back in Baltimore, and I kept chipping away at it from there.</w:t>
       </w:r>
     </w:p>
     <w:p>
@@ -9529,7 +9529,7 @@
         <w:pStyle w:val="BodyText"/>
       </w:pPr>
       <w:r>
-        <w:t xml:space="preserve">Between the corporate pressure at Koch, the MIT Sloan coursework, going to The Johns Hopkins University Whiting School of Engineering (and yes, we pronounce the</w:t>
+        <w:t xml:space="preserve">Between the corporate pressure at Koch, the MIT Sloan coursework, still chipping away at The Johns Hopkins University Whiting School of Engineering (and yes, we pronounce the</w:t>
       </w:r>
       <w:r>
         <w:t xml:space="preserve"> </w:t>

</xml_diff>

<commit_message>
Remove MIT Sloan (Michael didn't attend)
Co-authored-by: Mthompson6782 <Mthompson6782@users.noreply.github.com>
</commit_message>
<xml_diff>
--- a/Am_I_The_Bad_Guy_Master_Draft.docx
+++ b/Am_I_The_Bad_Guy_Master_Draft.docx
@@ -9407,31 +9407,15 @@
         <w:t xml:space="preserve"> </w:t>
       </w:r>
       <w:r>
-        <w:t xml:space="preserve">strategy and sent me to the</w:t>
-      </w:r>
-      <w:r>
-        <w:t xml:space="preserve"> </w:t>
-      </w:r>
-      <w:r>
-        <w:rPr>
-          <w:b/>
-          <w:bCs/>
-        </w:rPr>
-        <w:t xml:space="preserve">MIT Sloan School of Management</w:t>
-      </w:r>
-      <w:r>
-        <w:t xml:space="preserve"> </w:t>
-      </w:r>
-      <w:r>
-        <w:t xml:space="preserve">to sharpen the frameworks.</w:t>
-      </w:r>
-    </w:p>
-    <w:p>
-      <w:pPr>
-        <w:pStyle w:val="BodyText"/>
-      </w:pPr>
-      <w:r>
-        <w:t xml:space="preserve">A guy who had once sat in a Baltimore holding cell staring at fourteen felony counts was now sitting at MIT Sloan and in executive suites in Wichita, solving billion-dollar problems.</w:t>
+        <w:t xml:space="preserve">strategy.</w:t>
+      </w:r>
+    </w:p>
+    <w:p>
+      <w:pPr>
+        <w:pStyle w:val="BodyText"/>
+      </w:pPr>
+      <w:r>
+        <w:t xml:space="preserve">A guy who had once sat in a Baltimore holding cell staring at fourteen felony counts was now sitting in executive suites in Wichita, solving billion-dollar problems.</w:t>
       </w:r>
     </w:p>
     <w:p>
@@ -9529,7 +9513,7 @@
         <w:pStyle w:val="BodyText"/>
       </w:pPr>
       <w:r>
-        <w:t xml:space="preserve">Between the corporate pressure at Koch, the MIT Sloan coursework, still chipping away at The Johns Hopkins University Whiting School of Engineering (and yes, we pronounce the</w:t>
+        <w:t xml:space="preserve">Between the corporate pressure at Koch, still chipping away at The Johns Hopkins University Whiting School of Engineering (and yes, we pronounce the</w:t>
       </w:r>
       <w:r>
         <w:t xml:space="preserve"> </w:t>

</xml_diff>